<commit_message>
Remove company names, fix pptx overflow, clean up docx metadata
</commit_message>
<xml_diff>
--- a/reports/Credit_Risk_Analytics_Report.docx
+++ b/reports/Credit_Risk_Analytics_Report.docx
@@ -35,134 +35,7 @@
       </w:r>
     </w:p>
     <w:p/>
-    <w:p>
-      <w:pPr>
-        <w:jc w:val="center"/>
-      </w:pPr>
-      <w:r>
-        <w:rPr>
-          <w:color w:val="CCCCCC"/>
-          <w:sz w:val="20"/>
-        </w:rPr>
-        <w:t>____________________________________________________________</w:t>
-      </w:r>
-    </w:p>
     <w:p/>
-    <w:p>
-      <w:pPr>
-        <w:spacing w:before="0" w:after="40"/>
-        <w:jc w:val="center"/>
-      </w:pPr>
-      <w:r>
-        <w:rPr>
-          <w:rFonts w:ascii="Calibri" w:hAnsi="Calibri"/>
-          <w:b/>
-          <w:color w:val="333333"/>
-          <w:sz w:val="22"/>
-        </w:rPr>
-        <w:t xml:space="preserve">Prepared for: </w:t>
-      </w:r>
-      <w:r>
-        <w:rPr>
-          <w:rFonts w:ascii="Calibri" w:hAnsi="Calibri"/>
-          <w:color w:val="555555"/>
-          <w:sz w:val="22"/>
-        </w:rPr>
-        <w:t>Risk Committee</w:t>
-      </w:r>
-    </w:p>
-    <w:p>
-      <w:pPr>
-        <w:spacing w:before="0" w:after="40"/>
-        <w:jc w:val="center"/>
-      </w:pPr>
-      <w:r>
-        <w:rPr>
-          <w:rFonts w:ascii="Calibri" w:hAnsi="Calibri"/>
-          <w:b/>
-          <w:color w:val="333333"/>
-          <w:sz w:val="22"/>
-        </w:rPr>
-        <w:t xml:space="preserve">Prepared by: </w:t>
-      </w:r>
-      <w:r>
-        <w:rPr>
-          <w:rFonts w:ascii="Calibri" w:hAnsi="Calibri"/>
-          <w:color w:val="555555"/>
-          <w:sz w:val="22"/>
-        </w:rPr>
-        <w:t>Data Science Team</w:t>
-      </w:r>
-    </w:p>
-    <w:p>
-      <w:pPr>
-        <w:spacing w:before="0" w:after="40"/>
-        <w:jc w:val="center"/>
-      </w:pPr>
-      <w:r>
-        <w:rPr>
-          <w:rFonts w:ascii="Calibri" w:hAnsi="Calibri"/>
-          <w:b/>
-          <w:color w:val="333333"/>
-          <w:sz w:val="22"/>
-        </w:rPr>
-        <w:t xml:space="preserve">Date: </w:t>
-      </w:r>
-      <w:r>
-        <w:rPr>
-          <w:rFonts w:ascii="Calibri" w:hAnsi="Calibri"/>
-          <w:color w:val="555555"/>
-          <w:sz w:val="22"/>
-        </w:rPr>
-        <w:t>July 2026</w:t>
-      </w:r>
-    </w:p>
-    <w:p>
-      <w:pPr>
-        <w:spacing w:before="0" w:after="40"/>
-        <w:jc w:val="center"/>
-      </w:pPr>
-      <w:r>
-        <w:rPr>
-          <w:rFonts w:ascii="Calibri" w:hAnsi="Calibri"/>
-          <w:b/>
-          <w:color w:val="333333"/>
-          <w:sz w:val="22"/>
-        </w:rPr>
-        <w:t xml:space="preserve">Classification: </w:t>
-      </w:r>
-      <w:r>
-        <w:rPr>
-          <w:rFonts w:ascii="Calibri" w:hAnsi="Calibri"/>
-          <w:color w:val="555555"/>
-          <w:sz w:val="22"/>
-        </w:rPr>
-        <w:t>Confidential — Internal Use Only</w:t>
-      </w:r>
-    </w:p>
-    <w:p>
-      <w:pPr>
-        <w:spacing w:before="0" w:after="40"/>
-        <w:jc w:val="center"/>
-      </w:pPr>
-      <w:r>
-        <w:rPr>
-          <w:rFonts w:ascii="Calibri" w:hAnsi="Calibri"/>
-          <w:b/>
-          <w:color w:val="333333"/>
-          <w:sz w:val="22"/>
-        </w:rPr>
-        <w:t xml:space="preserve">Version: </w:t>
-      </w:r>
-      <w:r>
-        <w:rPr>
-          <w:rFonts w:ascii="Calibri" w:hAnsi="Calibri"/>
-          <w:color w:val="555555"/>
-          <w:sz w:val="22"/>
-        </w:rPr>
-        <w:t>1.0</w:t>
-      </w:r>
-    </w:p>
     <w:p/>
     <w:p/>
     <w:p>
@@ -546,7 +419,7 @@
           <w:rFonts w:ascii="Calibri" w:hAnsi="Calibri"/>
           <w:sz w:val="22"/>
         </w:rPr>
-        <w:t>the lending platform is a digital consumer-lending platform operating in the United States. The company offers unsecured personal loans from $1,000 to $35,000 with terms of 12 to 60 months. Borrowers apply online and receive decisions within minutes. Horizon's active portfolio comprises approximately 50,000 loans with total exposure exceeding $600 million.</w:t>
+        <w:t>the lending platform is a digital consumer-lending platform operating in the United States. The company offers unsecured personal loans from $1,000 to $35,000 with terms of 12 to 60 months. Borrowers apply online and receive decisions within minutes. the lending platform's active portfolio comprises approximately 50,000 loans with total exposure exceeding $600 million.</w:t>
       </w:r>
     </w:p>
     <w:p>
@@ -559,7 +432,7 @@
           <w:rFonts w:ascii="Calibri" w:hAnsi="Calibri"/>
           <w:sz w:val="22"/>
         </w:rPr>
-        <w:t>Horizon targets the near-prime segment — borrowers with credit scores between 580 and 680. This population is underserved by traditional banks, which typically require FICO scores above 680 for unsecured lending. However, near-prime borrowers carry higher default risk, making accurate risk assessment essential for sustainable profitability.</w:t>
+        <w:t>the lending platform targets the near-prime segment — borrowers with credit scores between 580 and 680. This population is underserved by traditional banks, which typically require FICO scores above 680 for unsecured lending. However, near-prime borrowers carry higher default risk, making accurate risk assessment essential for sustainable profitability.</w:t>
       </w:r>
     </w:p>
     <w:p>

</xml_diff>